<commit_message>
Reader for nodes & areas. Inser + Find for my trees with no assert
</commit_message>
<xml_diff>
--- a/doc/PouzitieAI_Niznansky.docx
+++ b/doc/PouzitieAI_Niznansky.docx
@@ -399,7 +399,7 @@
           <w:r>
             <w:fldChar w:fldCharType="separate"/>
           </w:r>
-          <w:hyperlink w:anchor="_Toc243655333" w:history="1">
+          <w:hyperlink w:anchor="_Toc243664189" w:history="1">
             <w:r>
               <w:rPr>
                 <w:rStyle w:val="Hyperlink"/>
@@ -445,7 +445,7 @@
                 <w:noProof/>
                 <w:webHidden/>
               </w:rPr>
-              <w:instrText xml:space="preserve"> PAGEREF _Toc243655333 \h </w:instrText>
+              <w:instrText xml:space="preserve"> PAGEREF _Toc243664189 \h </w:instrText>
             </w:r>
             <w:r>
               <w:rPr>
@@ -493,7 +493,7 @@
               <w14:ligatures w14:val="standardContextual"/>
             </w:rPr>
           </w:pPr>
-          <w:hyperlink w:anchor="_Toc243655334" w:history="1">
+          <w:hyperlink w:anchor="_Toc243664190" w:history="1">
             <w:r>
               <w:rPr>
                 <w:rStyle w:val="Hyperlink"/>
@@ -518,7 +518,7 @@
                 <w:rStyle w:val="Hyperlink"/>
                 <w:noProof/>
               </w:rPr>
-              <w:t>None</w:t>
+              <w:t>Načítanie slovakia_nodes.csv</w:t>
             </w:r>
             <w:r>
               <w:rPr>
@@ -539,7 +539,7 @@
                 <w:noProof/>
                 <w:webHidden/>
               </w:rPr>
-              <w:instrText xml:space="preserve"> PAGEREF _Toc243655334 \h </w:instrText>
+              <w:instrText xml:space="preserve"> PAGEREF _Toc243664190 \h </w:instrText>
             </w:r>
             <w:r>
               <w:rPr>
@@ -559,7 +559,7 @@
                 <w:noProof/>
                 <w:webHidden/>
               </w:rPr>
-              <w:t>2</w:t>
+              <w:t>3</w:t>
             </w:r>
             <w:r>
               <w:rPr>
@@ -599,7 +599,7 @@
       <w:pPr>
         <w:pStyle w:val="AIKapitola"/>
       </w:pPr>
-      <w:bookmarkStart w:id="0" w:name="_Toc243655333"/>
+      <w:bookmarkStart w:id="0" w:name="_Toc243664189"/>
       <w:r>
         <w:lastRenderedPageBreak/>
         <w:t>Intervalové vyhľadávanie v KD Strome</w:t>
@@ -611,6 +611,9 @@
         <w:pStyle w:val="SPtext"/>
       </w:pPr>
       <w:r>
+        <w:rPr>
+          <w:noProof/>
+        </w:rPr>
         <w:drawing>
           <wp:anchor distT="0" distB="0" distL="114300" distR="114300" simplePos="0" relativeHeight="251659264" behindDoc="0" locked="0" layoutInCell="1" allowOverlap="1" wp14:anchorId="157B87DB" wp14:editId="58C13391">
             <wp:simplePos x="0" y="0"/>
@@ -673,16 +676,78 @@
       <w:r>
         <w:t xml:space="preserve">intervalového vyhľadávania v KD Strome bol využitý model </w:t>
       </w:r>
+      <w:proofErr w:type="spellStart"/>
       <w:r>
         <w:rPr>
           <w:b/>
           <w:bCs/>
           <w:u w:val="single"/>
         </w:rPr>
-        <w:t>Cloude Sonnet 5.5, medium</w:t>
-      </w:r>
-      <w:r>
-        <w:t xml:space="preserve"> umelej inteligencie. AI nevygenerovala konkrétny kód, no poradila, akým spôsobom sa dá funkcia implementovať bez využitia rekurzie pomocou zásobníkov.</w:t>
+        <w:t>Cl</w:t>
+      </w:r>
+      <w:r>
+        <w:rPr>
+          <w:b/>
+          <w:bCs/>
+          <w:u w:val="single"/>
+        </w:rPr>
+        <w:t>a</w:t>
+      </w:r>
+      <w:r>
+        <w:rPr>
+          <w:b/>
+          <w:bCs/>
+          <w:u w:val="single"/>
+        </w:rPr>
+        <w:t>ude</w:t>
+      </w:r>
+      <w:proofErr w:type="spellEnd"/>
+      <w:r>
+        <w:rPr>
+          <w:b/>
+          <w:bCs/>
+          <w:u w:val="single"/>
+        </w:rPr>
+        <w:t xml:space="preserve"> </w:t>
+      </w:r>
+      <w:proofErr w:type="spellStart"/>
+      <w:r>
+        <w:rPr>
+          <w:b/>
+          <w:bCs/>
+          <w:u w:val="single"/>
+        </w:rPr>
+        <w:t>Sonnet</w:t>
+      </w:r>
+      <w:proofErr w:type="spellEnd"/>
+      <w:r>
+        <w:rPr>
+          <w:b/>
+          <w:bCs/>
+          <w:u w:val="single"/>
+        </w:rPr>
+        <w:t xml:space="preserve"> 5.5, </w:t>
+      </w:r>
+      <w:proofErr w:type="spellStart"/>
+      <w:r>
+        <w:rPr>
+          <w:b/>
+          <w:bCs/>
+          <w:u w:val="single"/>
+        </w:rPr>
+        <w:t>medium</w:t>
+      </w:r>
+      <w:proofErr w:type="spellEnd"/>
+      <w:r>
+        <w:t xml:space="preserve"> umelej inteligencie. AI nevygenerovala konkrétny kód, no poradila, akým spôsobom sa dá funkcia implementovať bez využitia </w:t>
+      </w:r>
+      <w:proofErr w:type="spellStart"/>
+      <w:r>
+        <w:t>rekurzie</w:t>
+      </w:r>
+      <w:proofErr w:type="spellEnd"/>
+      <w:r>
+        <w:t xml:space="preserve"> pomocou zásobníkov.</w:t>
       </w:r>
     </w:p>
     <w:p>
@@ -693,6 +758,7 @@
       <w:r>
         <w:rPr>
           <w:rFonts w:asciiTheme="minorHAnsi" w:hAnsiTheme="minorHAnsi"/>
+          <w:noProof/>
         </w:rPr>
         <w:drawing>
           <wp:anchor distT="0" distB="0" distL="114300" distR="114300" simplePos="0" relativeHeight="251660288" behindDoc="0" locked="0" layoutInCell="1" allowOverlap="1" wp14:anchorId="4325C23A" wp14:editId="0559502E">
@@ -783,12 +849,21 @@
       <w:pPr>
         <w:pStyle w:val="SPtext"/>
       </w:pPr>
+      <w:proofErr w:type="spellStart"/>
       <w:r>
         <w:rPr>
           <w:b/>
           <w:bCs/>
         </w:rPr>
-        <w:t xml:space="preserve">Link: </w:t>
+        <w:t>Link</w:t>
+      </w:r>
+      <w:proofErr w:type="spellEnd"/>
+      <w:r>
+        <w:rPr>
+          <w:b/>
+          <w:bCs/>
+        </w:rPr>
+        <w:t xml:space="preserve">: </w:t>
       </w:r>
       <w:hyperlink r:id="rId14" w:history="1">
         <w:r>
@@ -809,17 +884,205 @@
     </w:p>
     <w:p>
       <w:pPr>
+        <w:rPr>
+          <w:rFonts w:asciiTheme="majorHAnsi" w:eastAsiaTheme="majorEastAsia" w:hAnsiTheme="majorHAnsi" w:cstheme="majorBidi"/>
+          <w:color w:val="2F5496" w:themeColor="accent1" w:themeShade="BF"/>
+          <w:sz w:val="32"/>
+          <w:szCs w:val="32"/>
+        </w:rPr>
+      </w:pPr>
+      <w:r>
+        <w:br w:type="page"/>
+      </w:r>
+    </w:p>
+    <w:p>
+      <w:pPr>
         <w:pStyle w:val="AIKapitola"/>
       </w:pPr>
-      <w:bookmarkStart w:id="1" w:name="_Toc243655334"/>
-      <w:r>
-        <w:t>None</w:t>
+      <w:bookmarkStart w:id="1" w:name="_Toc243664190"/>
+      <w:r>
+        <w:lastRenderedPageBreak/>
+        <w:t>N</w:t>
+      </w:r>
+      <w:r>
+        <w:t>ačítanie slovakia_nodes.csv</w:t>
       </w:r>
       <w:bookmarkEnd w:id="1"/>
     </w:p>
+    <w:p>
+      <w:pPr>
+        <w:pStyle w:val="SPtext"/>
+      </w:pPr>
+      <w:r>
+        <w:drawing>
+          <wp:anchor distT="0" distB="0" distL="114300" distR="114300" simplePos="0" relativeHeight="251661312" behindDoc="1" locked="0" layoutInCell="1" allowOverlap="1" wp14:anchorId="4DA68A7C" wp14:editId="65E19A6D">
+            <wp:simplePos x="0" y="0"/>
+            <wp:positionH relativeFrom="margin">
+              <wp:align>right</wp:align>
+            </wp:positionH>
+            <wp:positionV relativeFrom="paragraph">
+              <wp:posOffset>455295</wp:posOffset>
+            </wp:positionV>
+            <wp:extent cx="5760720" cy="2865120"/>
+            <wp:effectExtent l="0" t="0" r="0" b="0"/>
+            <wp:wrapTight wrapText="bothSides">
+              <wp:wrapPolygon edited="0">
+                <wp:start x="0" y="0"/>
+                <wp:lineTo x="0" y="21399"/>
+                <wp:lineTo x="21500" y="21399"/>
+                <wp:lineTo x="21500" y="0"/>
+                <wp:lineTo x="0" y="0"/>
+              </wp:wrapPolygon>
+            </wp:wrapTight>
+            <wp:docPr id="210683078" name="Picture 1"/>
+            <wp:cNvGraphicFramePr>
+              <a:graphicFrameLocks xmlns:a="http://schemas.openxmlformats.org/drawingml/2006/main" noChangeAspect="1"/>
+            </wp:cNvGraphicFramePr>
+            <a:graphic xmlns:a="http://schemas.openxmlformats.org/drawingml/2006/main">
+              <a:graphicData uri="http://schemas.openxmlformats.org/drawingml/2006/picture">
+                <pic:pic xmlns:pic="http://schemas.openxmlformats.org/drawingml/2006/picture">
+                  <pic:nvPicPr>
+                    <pic:cNvPr id="210683078" name=""/>
+                    <pic:cNvPicPr/>
+                  </pic:nvPicPr>
+                  <pic:blipFill>
+                    <a:blip r:embed="rId15">
+                      <a:extLst>
+                        <a:ext uri="{28A0092B-C50C-407E-A947-70E740481C1C}">
+                          <a14:useLocalDpi xmlns:a14="http://schemas.microsoft.com/office/drawing/2010/main" val="0"/>
+                        </a:ext>
+                      </a:extLst>
+                    </a:blip>
+                    <a:stretch>
+                      <a:fillRect/>
+                    </a:stretch>
+                  </pic:blipFill>
+                  <pic:spPr>
+                    <a:xfrm>
+                      <a:off x="0" y="0"/>
+                      <a:ext cx="5760720" cy="2865120"/>
+                    </a:xfrm>
+                    <a:prstGeom prst="rect">
+                      <a:avLst/>
+                    </a:prstGeom>
+                  </pic:spPr>
+                </pic:pic>
+              </a:graphicData>
+            </a:graphic>
+            <wp14:sizeRelH relativeFrom="page">
+              <wp14:pctWidth>0</wp14:pctWidth>
+            </wp14:sizeRelH>
+            <wp14:sizeRelV relativeFrom="page">
+              <wp14:pctHeight>0</wp14:pctHeight>
+            </wp14:sizeRelV>
+          </wp:anchor>
+        </w:drawing>
+      </w:r>
+      <w:r>
+        <w:t xml:space="preserve">Pri implementácia načítavania CSV súboru bol využitý model </w:t>
+      </w:r>
+      <w:proofErr w:type="spellStart"/>
+      <w:r>
+        <w:rPr>
+          <w:b/>
+          <w:bCs/>
+          <w:u w:val="single"/>
+        </w:rPr>
+        <w:t>Claude</w:t>
+      </w:r>
+      <w:proofErr w:type="spellEnd"/>
+      <w:r>
+        <w:rPr>
+          <w:b/>
+          <w:bCs/>
+          <w:u w:val="single"/>
+        </w:rPr>
+        <w:t xml:space="preserve"> </w:t>
+      </w:r>
+      <w:proofErr w:type="spellStart"/>
+      <w:r>
+        <w:rPr>
+          <w:b/>
+          <w:bCs/>
+          <w:u w:val="single"/>
+        </w:rPr>
+        <w:t>Sonnet</w:t>
+      </w:r>
+      <w:proofErr w:type="spellEnd"/>
+      <w:r>
+        <w:rPr>
+          <w:b/>
+          <w:bCs/>
+          <w:u w:val="single"/>
+        </w:rPr>
+        <w:t xml:space="preserve"> 5.5, </w:t>
+      </w:r>
+      <w:proofErr w:type="spellStart"/>
+      <w:r>
+        <w:rPr>
+          <w:b/>
+          <w:bCs/>
+          <w:u w:val="single"/>
+        </w:rPr>
+        <w:t>medium</w:t>
+      </w:r>
+      <w:proofErr w:type="spellEnd"/>
+      <w:r>
+        <w:t xml:space="preserve"> umelej inteligencie. AI vygenerovala kód na rýchle delenie </w:t>
+      </w:r>
+      <w:proofErr w:type="spellStart"/>
+      <w:r>
+        <w:t>String</w:t>
+      </w:r>
+      <w:proofErr w:type="spellEnd"/>
+      <w:r>
+        <w:t>-u.</w:t>
+      </w:r>
+    </w:p>
+    <w:p>
+      <w:pPr>
+        <w:pStyle w:val="SPtext"/>
+        <w:jc w:val="center"/>
+        <w:rPr>
+          <w:b/>
+          <w:bCs/>
+        </w:rPr>
+      </w:pPr>
+      <w:proofErr w:type="spellStart"/>
+      <w:r>
+        <w:rPr>
+          <w:b/>
+          <w:bCs/>
+        </w:rPr>
+        <w:t>Link</w:t>
+      </w:r>
+      <w:proofErr w:type="spellEnd"/>
+      <w:r>
+        <w:rPr>
+          <w:b/>
+          <w:bCs/>
+        </w:rPr>
+        <w:t xml:space="preserve">: </w:t>
+      </w:r>
+      <w:hyperlink r:id="rId16" w:history="1">
+        <w:r>
+          <w:rPr>
+            <w:rStyle w:val="Hyperlink"/>
+            <w:b/>
+            <w:bCs/>
+          </w:rPr>
+          <w:t>https://claude.ai/share/cdc08eee-e656-42a2-abb1-1d27a38fe828</w:t>
+        </w:r>
+      </w:hyperlink>
+    </w:p>
+    <w:p>
+      <w:pPr>
+        <w:pStyle w:val="AIKapitola"/>
+      </w:pPr>
+    </w:p>
     <w:sectPr>
-      <w:headerReference w:type="default" r:id="rId15"/>
-      <w:footerReference w:type="default" r:id="rId16"/>
+      <w:headerReference w:type="default" r:id="rId17"/>
+      <w:footerReference w:type="default" r:id="rId18"/>
       <w:pgSz w:w="11906" w:h="16838"/>
       <w:pgMar w:top="1417" w:right="1417" w:bottom="1417" w:left="1417" w:header="708" w:footer="708" w:gutter="0"/>
       <w:pgNumType w:start="1"/>
@@ -4129,6 +4392,7 @@
     <w:rsid w:val="00491B40"/>
     <w:rsid w:val="00556739"/>
     <w:rsid w:val="00560924"/>
+    <w:rsid w:val="005C6B1B"/>
     <w:rsid w:val="00687D0F"/>
     <w:rsid w:val="006C0D51"/>
     <w:rsid w:val="0079426B"/>
@@ -4136,6 +4400,7 @@
     <w:rsid w:val="008A7607"/>
     <w:rsid w:val="008D71FC"/>
     <w:rsid w:val="008E579D"/>
+    <w:rsid w:val="00907E09"/>
     <w:rsid w:val="00944710"/>
     <w:rsid w:val="00972330"/>
     <w:rsid w:val="009A6F6C"/>
@@ -4921,16 +5186,25 @@
 </file>
 
 <file path=customXml/item1.xml><?xml version="1.0" encoding="utf-8"?>
-<b:Sources xmlns:b="http://schemas.openxmlformats.org/officeDocument/2006/bibliography" xmlns="http://schemas.openxmlformats.org/officeDocument/2006/bibliography" SelectedStyle="\APASixthEditionOfficeOnline.xsl" StyleName="APA" Version="6"/>
-</file>
-
-<file path=customXml/item2.xml><?xml version="1.0" encoding="utf-8"?>
 <p:properties xmlns:p="http://schemas.microsoft.com/office/2006/metadata/properties" xmlns:xsi="http://www.w3.org/2001/XMLSchema-instance" xmlns:pc="http://schemas.microsoft.com/office/infopath/2007/PartnerControls">
   <documentManagement/>
 </p:properties>
 </file>
 
+<file path=customXml/item2.xml><?xml version="1.0" encoding="utf-8"?>
+<b:Sources xmlns:b="http://schemas.openxmlformats.org/officeDocument/2006/bibliography" xmlns="http://schemas.openxmlformats.org/officeDocument/2006/bibliography" SelectedStyle="\APASixthEditionOfficeOnline.xsl" StyleName="APA" Version="6"/>
+</file>
+
 <file path=customXml/item3.xml><?xml version="1.0" encoding="utf-8"?>
+<?mso-contentType ?>
+<FormTemplates xmlns="http://schemas.microsoft.com/sharepoint/v3/contenttype/forms">
+  <Display>DocumentLibraryForm</Display>
+  <Edit>DocumentLibraryForm</Edit>
+  <New>DocumentLibraryForm</New>
+</FormTemplates>
+</file>
+
+<file path=customXml/item4.xml><?xml version="1.0" encoding="utf-8"?>
 <ct:contentTypeSchema xmlns:ct="http://schemas.microsoft.com/office/2006/metadata/contentType" xmlns:ma="http://schemas.microsoft.com/office/2006/metadata/properties/metaAttributes" ct:_="" ma:_="" ma:contentTypeName="Dokument" ma:contentTypeID="0x0101003AB2D83F1BFE774693A9D47ED296DF0D" ma:contentTypeVersion="9" ma:contentTypeDescription="Umožňuje vytvoriť nový dokument." ma:contentTypeScope="" ma:versionID="60122e2a515457b5823611993d906c8b">
   <xsd:schema xmlns:xsd="http://www.w3.org/2001/XMLSchema" xmlns:xs="http://www.w3.org/2001/XMLSchema" xmlns:p="http://schemas.microsoft.com/office/2006/metadata/properties" xmlns:ns2="7d1569f7-a9ba-4934-9f41-02a47fb0fb0d" targetNamespace="http://schemas.microsoft.com/office/2006/metadata/properties" ma:root="true" ma:fieldsID="d3efe9633a98463fed113fc2a31a3b47" ns2:_="">
     <xsd:import namespace="7d1569f7-a9ba-4934-9f41-02a47fb0fb0d"/>
@@ -5104,24 +5378,7 @@
 </ct:contentTypeSchema>
 </file>
 
-<file path=customXml/item4.xml><?xml version="1.0" encoding="utf-8"?>
-<?mso-contentType ?>
-<FormTemplates xmlns="http://schemas.microsoft.com/sharepoint/v3/contenttype/forms">
-  <Display>DocumentLibraryForm</Display>
-  <Edit>DocumentLibraryForm</Edit>
-  <New>DocumentLibraryForm</New>
-</FormTemplates>
-</file>
-
 <file path=customXml/itemProps1.xml><?xml version="1.0" encoding="utf-8"?>
-<ds:datastoreItem xmlns:ds="http://schemas.openxmlformats.org/officeDocument/2006/customXml" ds:itemID="{DC141BBF-D250-46B3-8BB9-3FC834D9A0D1}">
-  <ds:schemaRefs>
-    <ds:schemaRef ds:uri="http://schemas.openxmlformats.org/officeDocument/2006/bibliography"/>
-  </ds:schemaRefs>
-</ds:datastoreItem>
-</file>
-
-<file path=customXml/itemProps2.xml><?xml version="1.0" encoding="utf-8"?>
 <ds:datastoreItem xmlns:ds="http://schemas.openxmlformats.org/officeDocument/2006/customXml" ds:itemID="{FE7A2F48-B42E-4D81-8042-A4FF78073969}">
   <ds:schemaRefs>
     <ds:schemaRef ds:uri="http://schemas.microsoft.com/office/2006/metadata/properties"/>
@@ -5130,7 +5387,23 @@
 </ds:datastoreItem>
 </file>
 
+<file path=customXml/itemProps2.xml><?xml version="1.0" encoding="utf-8"?>
+<ds:datastoreItem xmlns:ds="http://schemas.openxmlformats.org/officeDocument/2006/customXml" ds:itemID="{DC141BBF-D250-46B3-8BB9-3FC834D9A0D1}">
+  <ds:schemaRefs>
+    <ds:schemaRef ds:uri="http://schemas.openxmlformats.org/officeDocument/2006/bibliography"/>
+  </ds:schemaRefs>
+</ds:datastoreItem>
+</file>
+
 <file path=customXml/itemProps3.xml><?xml version="1.0" encoding="utf-8"?>
+<ds:datastoreItem xmlns:ds="http://schemas.openxmlformats.org/officeDocument/2006/customXml" ds:itemID="{82CF81AA-32B6-4712-911A-7ADBBAC06A62}">
+  <ds:schemaRefs>
+    <ds:schemaRef ds:uri="http://schemas.microsoft.com/sharepoint/v3/contenttype/forms"/>
+  </ds:schemaRefs>
+</ds:datastoreItem>
+</file>
+
+<file path=customXml/itemProps4.xml><?xml version="1.0" encoding="utf-8"?>
 <ds:datastoreItem xmlns:ds="http://schemas.openxmlformats.org/officeDocument/2006/customXml" ds:itemID="{7B2C86A9-DC76-405D-BE13-BFDC736CF9BD}">
   <ds:schemaRefs>
     <ds:schemaRef ds:uri="http://schemas.microsoft.com/office/2006/metadata/contentType"/>
@@ -5146,12 +5419,4 @@
     <ds:schemaRef ds:uri="http://schemas.microsoft.com/internal/obd"/>
   </ds:schemaRefs>
 </ds:datastoreItem>
-</file>
-
-<file path=customXml/itemProps4.xml><?xml version="1.0" encoding="utf-8"?>
-<ds:datastoreItem xmlns:ds="http://schemas.openxmlformats.org/officeDocument/2006/customXml" ds:itemID="{82CF81AA-32B6-4712-911A-7ADBBAC06A62}">
-  <ds:schemaRefs>
-    <ds:schemaRef ds:uri="http://schemas.microsoft.com/sharepoint/v3/contenttype/forms"/>
-  </ds:schemaRefs>
-</ds:datastoreItem>
 </file>
</xml_diff>